<commit_message>
v144: §1.2 Prohibition of Torture and Cruel Treatment restored (provision text was missing — section heading existed but content lost during editing; restored with updated EI/NRS language replacing stale §2.7 reference); three new scenarios: The Supreme Court Election (§4.2 open-candidacy, JI certification dispute, Board advisory under pressure), The Presidential Recall (§2.10.b 'all eligible voters' threshold fails by 1.6M despite 82% turnout/57% support), The Budget Impasse (§10.2.a parallel pay withholding, Day 19 resolution, escrowed restoration); 338 annotated provisions, 31 scenarios
</commit_message>
<xml_diff>
--- a/constitution-v143.docx
+++ b/constitution-v143.docx
@@ -313,6 +313,26 @@
           <w:szCs w:val="23"/>
         </w:rPr>
         <w:t xml:space="preserve">Section 1.2 — Prohibition of Torture and Cruel Treatment</w:t>
+      </w:r>
+    </w:p>
+    <w:p>
+      <w:pPr>
+        <w:spacing w:before="60" w:after="60" w:line="280" w:lineRule="auto"/>
+        <w:jc w:val="both"/>
+      </w:pPr>
+      <w:r>
+        <w:rPr>
+          <w:b/>
+          <w:sz w:val="22"/>
+          <w:color w:val="1B2A4A"/>
+        </w:rPr>
+        <w:t xml:space="preserve">1.2 Prohibition of Torture and Cruel Treatment: </w:t>
+      </w:r>
+      <w:r>
+        <w:rPr>
+          <w:sz w:val="22"/>
+        </w:rPr>
+        <w:t xml:space="preserve">No person in the custody or control of the Republic, its agents, or any entity acting on its behalf may be subjected to torture, cruel, degrading, or inhumane treatment or punishment under any circumstances. No declared emergency, legislative act, executive order, or military necessity may authorize or excuse a violation. Any official who orders, authorizes, or knowingly permits such treatment commits a criminal offense under federal statute; the Executive Inspectorate reports any such violation to the National Record System. This prohibition is permanently unamendable under §15.3.</w:t>
       </w:r>
     </w:p>
     <w:p>

</xml_diff>